<commit_message>
- Style product image, tags, title, rating and description - Style prices, discount badge and purchase link - Add review cards with usernames, star icons and review text - Use grid areas for mobile and desktop product layouts - Adjust product page width and image height for tablets - Improve carousel spacing and font sizes on tablets - Replace the text back arrow with an icon - Move product, account and cart pages to the paths in the brief - Update product links and header/footer navigation
</commit_message>
<xml_diff>
--- a/docs/TING Reflection Report - Working Draft.docx
+++ b/docs/TING Reflection Report - Working Draft.docx
@@ -1036,6 +1036,12 @@
       </w:pPr>
       <w:r>
         <w:t>Figma lessons</w:t>
+      </w:r>
+    </w:p>
+    <w:p>
+      <w:pPr/>
+      <w:r>
+        <w:t>Before using CSS Grid areas in the project, I had already read about the concept. I then used AI to ask for a clearer explanation of how grid-template-areas and grid-area work together, including why the grid items must be direct children of the grid container. This gave me a better understanding of the technique before I applied it to the responsive single-product layout in the project.</w:t>
       </w:r>
     </w:p>
     <w:tbl>

</xml_diff>